<commit_message>
BR-002: point the guide at the Speak Up help center link
Renaming the help center in the sandbox moved its address from
/helpcenter/WhistleblowingReporting to /helpcenter/SpeakUp, and the old
link now shows an error page. The guide uses the new link, and BR-002
records the change so production links get replaced too.

Co-Authored-By: Claude Opus 5.5 <noreply@anthropic.com>
</commit_message>
<xml_diff>
--- a/docs/WB-User-Guide-v1.2-DRAFT.docx
+++ b/docs/WB-User-Guide-v1.2-DRAFT.docx
@@ -747,7 +747,7 @@
     <w:sdt>
       <w:sdtPr>
         <w:alias w:val="Contents"/>
-        <w:id w:val="-2094934781"/>
+        <w:id w:val="-567955887"/>
       </w:sdtPr>
       <w:sdtEndPr/>
       <w:sdtContent>
@@ -774,7 +774,7 @@
           <w:r>
             <w:fldChar w:fldCharType="separate"/>
           </w:r>
-          <w:hyperlink w:anchor="_Toc243485398" w:history="1">
+          <w:hyperlink w:anchor="_Toc243486133" w:history="1">
             <w:r>
               <w:rPr>
                 <w:rStyle w:val="Hyperlink"/>
@@ -798,7 +798,7 @@
               <w:rPr>
                 <w:noProof/>
               </w:rPr>
-              <w:instrText xml:space="preserve"> PAGEREF _Toc243485398 \h </w:instrText>
+              <w:instrText xml:space="preserve"> PAGEREF _Toc243486133 \h </w:instrText>
             </w:r>
             <w:r>
               <w:rPr>
@@ -839,7 +839,7 @@
               <w:szCs w:val="22"/>
             </w:rPr>
           </w:pPr>
-          <w:hyperlink w:anchor="_Toc243485399" w:history="1">
+          <w:hyperlink w:anchor="_Toc243486134" w:history="1">
             <w:r>
               <w:rPr>
                 <w:rStyle w:val="Hyperlink"/>
@@ -863,7 +863,7 @@
               <w:rPr>
                 <w:noProof/>
               </w:rPr>
-              <w:instrText xml:space="preserve"> PAGEREF _Toc243485399 \h </w:instrText>
+              <w:instrText xml:space="preserve"> PAGEREF _Toc243486134 \h </w:instrText>
             </w:r>
             <w:r>
               <w:rPr>
@@ -904,7 +904,7 @@
               <w:szCs w:val="22"/>
             </w:rPr>
           </w:pPr>
-          <w:hyperlink w:anchor="_Toc243485400" w:history="1">
+          <w:hyperlink w:anchor="_Toc243486135" w:history="1">
             <w:r>
               <w:rPr>
                 <w:rStyle w:val="Hyperlink"/>
@@ -928,7 +928,7 @@
               <w:rPr>
                 <w:noProof/>
               </w:rPr>
-              <w:instrText xml:space="preserve"> PAGEREF _Toc243485400 \h </w:instrText>
+              <w:instrText xml:space="preserve"> PAGEREF _Toc243486135 \h </w:instrText>
             </w:r>
             <w:r>
               <w:rPr>
@@ -969,7 +969,7 @@
               <w:szCs w:val="22"/>
             </w:rPr>
           </w:pPr>
-          <w:hyperlink w:anchor="_Toc243485401" w:history="1">
+          <w:hyperlink w:anchor="_Toc243486136" w:history="1">
             <w:r>
               <w:rPr>
                 <w:rStyle w:val="Hyperlink"/>
@@ -993,7 +993,7 @@
               <w:rPr>
                 <w:noProof/>
               </w:rPr>
-              <w:instrText xml:space="preserve"> PAGEREF _Toc243485401 \h </w:instrText>
+              <w:instrText xml:space="preserve"> PAGEREF _Toc243486136 \h </w:instrText>
             </w:r>
             <w:r>
               <w:rPr>
@@ -1034,7 +1034,7 @@
               <w:szCs w:val="22"/>
             </w:rPr>
           </w:pPr>
-          <w:hyperlink w:anchor="_Toc243485402" w:history="1">
+          <w:hyperlink w:anchor="_Toc243486137" w:history="1">
             <w:r>
               <w:rPr>
                 <w:rStyle w:val="Hyperlink"/>
@@ -1058,7 +1058,7 @@
               <w:rPr>
                 <w:noProof/>
               </w:rPr>
-              <w:instrText xml:space="preserve"> PAGEREF _Toc243485402 \h </w:instrText>
+              <w:instrText xml:space="preserve"> PAGEREF _Toc243486137 \h </w:instrText>
             </w:r>
             <w:r>
               <w:rPr>
@@ -1099,7 +1099,7 @@
               <w:szCs w:val="22"/>
             </w:rPr>
           </w:pPr>
-          <w:hyperlink w:anchor="_Toc243485403" w:history="1">
+          <w:hyperlink w:anchor="_Toc243486138" w:history="1">
             <w:r>
               <w:rPr>
                 <w:rStyle w:val="Hyperlink"/>
@@ -1123,7 +1123,7 @@
               <w:rPr>
                 <w:noProof/>
               </w:rPr>
-              <w:instrText xml:space="preserve"> PAGEREF _Toc243485403 \h </w:instrText>
+              <w:instrText xml:space="preserve"> PAGEREF _Toc243486138 \h </w:instrText>
             </w:r>
             <w:r>
               <w:rPr>
@@ -1164,7 +1164,7 @@
               <w:szCs w:val="22"/>
             </w:rPr>
           </w:pPr>
-          <w:hyperlink w:anchor="_Toc243485404" w:history="1">
+          <w:hyperlink w:anchor="_Toc243486139" w:history="1">
             <w:r>
               <w:rPr>
                 <w:rStyle w:val="Hyperlink"/>
@@ -1188,7 +1188,7 @@
               <w:rPr>
                 <w:noProof/>
               </w:rPr>
-              <w:instrText xml:space="preserve"> PAGEREF _Toc243485404 \h </w:instrText>
+              <w:instrText xml:space="preserve"> PAGEREF _Toc243486139 \h </w:instrText>
             </w:r>
             <w:r>
               <w:rPr>
@@ -1314,7 +1314,7 @@
         </w:pBdr>
         <w:spacing w:before="360" w:after="160"/>
       </w:pPr>
-      <w:bookmarkStart w:id="1" w:name="_Toc243485398"/>
+      <w:bookmarkStart w:id="1" w:name="_Toc243486133"/>
       <w:r>
         <w:lastRenderedPageBreak/>
         <w:t>1. About the portal</w:t>
@@ -1778,7 +1778,7 @@
         </w:pBdr>
         <w:spacing w:before="360" w:after="160"/>
       </w:pPr>
-      <w:bookmarkStart w:id="2" w:name="_Toc243485399"/>
+      <w:bookmarkStart w:id="2" w:name="_Toc243486134"/>
       <w:r>
         <w:t>2. How to submit a report</w:t>
       </w:r>
@@ -1809,7 +1809,7 @@
           <w:color w:val="228848"/>
           <w:u w:val="single"/>
         </w:rPr>
-        <w:t>https://erc-sd-sandbox.atlassian.net/helpcenter/WhistleblowingReporting/portal/169/group/274/create/474?email=Anonymous%40Anonymous.com</w:t>
+        <w:t>https://erc-sd-sandbox.atlassian.net/helpcenter/SpeakUp/portal/169/group/274/create/474?email=Anonymous%40Anonymous.com</w:t>
       </w:r>
     </w:p>
     <w:p>
@@ -1842,10 +1842,10 @@
         <w:t xml:space="preserve">Email confirmation to </w:t>
       </w:r>
       <w:r>
-        <w:t>is alread</w:t>
-      </w:r>
-      <w:r>
-        <w:t>y filled with Anonymous@Anonymous.com. Leave it to stay anonymous, or replace it with your own email.</w:t>
+        <w:t>is already filled with An</w:t>
+      </w:r>
+      <w:r>
+        <w:t>onymous@Anonymous.com. Leave it to stay anonymous, or replace it with your own email.</w:t>
       </w:r>
     </w:p>
     <w:p>
@@ -1930,10 +1930,10 @@
         <w:t xml:space="preserve"> </w:t>
       </w:r>
       <w:r>
-        <w:t>(optional): only if you want the Compliance team to b</w:t>
-      </w:r>
-      <w:r>
-        <w:t>e able to contact you.</w:t>
+        <w:t>(optional): only if you want the Compliance team to be able to contac</w:t>
+      </w:r>
+      <w:r>
+        <w:t>t you.</w:t>
       </w:r>
     </w:p>
     <w:p>
@@ -1996,10 +1996,10 @@
         <w:t>Send</w:t>
       </w:r>
       <w:r>
-        <w:t>. A reference number such as WB-36 is shown. Keep it if you want to</w:t>
-      </w:r>
-      <w:r>
-        <w:t xml:space="preserve"> refer to your report later.</w:t>
+        <w:t>. A reference number such as WB-36 is shown. Keep it if you want to refer to your r</w:t>
+      </w:r>
+      <w:r>
+        <w:t>eport later.</w:t>
       </w:r>
     </w:p>
     <w:p>
@@ -2079,7 +2079,7 @@
         </w:pBdr>
         <w:spacing w:before="360" w:after="160"/>
       </w:pPr>
-      <w:bookmarkStart w:id="3" w:name="_Toc243485400"/>
+      <w:bookmarkStart w:id="3" w:name="_Toc243486135"/>
       <w:r>
         <w:lastRenderedPageBreak/>
         <w:t>3. What happens after you submit</w:t>
@@ -2243,7 +2243,7 @@
         </w:pBdr>
         <w:spacing w:before="360" w:after="160"/>
       </w:pPr>
-      <w:bookmarkStart w:id="4" w:name="_Toc243485401"/>
+      <w:bookmarkStart w:id="4" w:name="_Toc243486136"/>
       <w:r>
         <w:t>4. For the Compliance Manager</w:t>
       </w:r>
@@ -2683,7 +2683,7 @@
         </w:pBdr>
         <w:spacing w:before="360" w:after="160"/>
       </w:pPr>
-      <w:bookmarkStart w:id="5" w:name="_Toc243485402"/>
+      <w:bookmarkStart w:id="5" w:name="_Toc243486137"/>
       <w:r>
         <w:t>5. For investigation teams</w:t>
       </w:r>
@@ -3019,7 +3019,7 @@
         </w:pBdr>
         <w:spacing w:before="360" w:after="160"/>
       </w:pPr>
-      <w:bookmarkStart w:id="6" w:name="_Toc243485403"/>
+      <w:bookmarkStart w:id="6" w:name="_Toc243486138"/>
       <w:r>
         <w:t>6. Groups: who sees what and who can do what</w:t>
       </w:r>
@@ -5326,7 +5326,7 @@
         </w:pBdr>
         <w:spacing w:before="360" w:after="160"/>
       </w:pPr>
-      <w:bookmarkStart w:id="7" w:name="_Toc243485404"/>
+      <w:bookmarkStart w:id="7" w:name="_Toc243486139"/>
       <w:r>
         <w:t>7. Service levels and escalation</w:t>
       </w:r>
@@ -6051,10 +6051,71 @@
 <file path=word/numbering.xml><?xml version="1.0" encoding="utf-8"?>
 <w:numbering xmlns:wpc="http://schemas.microsoft.com/office/word/2010/wordprocessingCanvas" xmlns:mc="http://schemas.openxmlformats.org/markup-compatibility/2006" xmlns:o="urn:schemas-microsoft-com:office:office" xmlns:r="http://schemas.openxmlformats.org/officeDocument/2006/relationships" xmlns:m="http://schemas.openxmlformats.org/officeDocument/2006/math" xmlns:v="urn:schemas-microsoft-com:vml" xmlns:wp14="http://schemas.microsoft.com/office/word/2010/wordprocessingDrawing" xmlns:wp="http://schemas.openxmlformats.org/drawingml/2006/wordprocessingDrawing" xmlns:w10="urn:schemas-microsoft-com:office:word" xmlns:w="http://schemas.openxmlformats.org/wordprocessingml/2006/main" xmlns:w14="http://schemas.microsoft.com/office/word/2010/wordml" xmlns:wpg="http://schemas.microsoft.com/office/word/2010/wordprocessingGroup" xmlns:wpi="http://schemas.microsoft.com/office/word/2010/wordprocessingInk" xmlns:wne="http://schemas.microsoft.com/office/word/2006/wordml" xmlns:wps="http://schemas.microsoft.com/office/word/2010/wordprocessingShape" mc:Ignorable="w14 wp14">
   <w:abstractNum w:abstractNumId="0">
-    <w:nsid w:val="04346856"/>
+    <w:nsid w:val="065B045E"/>
     <w:multiLevelType w:val="hybridMultilevel"/>
-    <w:tmpl w:val="FC423A5C"/>
-    <w:lvl w:ilvl="0" w:tplc="69C07628">
+    <w:tmpl w:val="7FAC57DA"/>
+    <w:lvl w:ilvl="0" w:tplc="D548D3C6">
+      <w:start w:val="1"/>
+      <w:numFmt w:val="bullet"/>
+      <w:lvlText w:val="•"/>
+      <w:lvlJc w:val="left"/>
+      <w:pPr>
+        <w:ind w:left="540" w:hanging="270"/>
+      </w:pPr>
+      <w:rPr>
+        <w:color w:val="228848"/>
+      </w:rPr>
+    </w:lvl>
+    <w:lvl w:ilvl="1" w:tplc="DB805C92">
+      <w:start w:val="1"/>
+      <w:numFmt w:val="bullet"/>
+      <w:lvlText w:val="–"/>
+      <w:lvlJc w:val="left"/>
+      <w:pPr>
+        <w:ind w:left="1080" w:hanging="270"/>
+      </w:pPr>
+    </w:lvl>
+    <w:lvl w:ilvl="2" w:tplc="AB069AA0">
+      <w:numFmt w:val="decimal"/>
+      <w:lvlText w:val=""/>
+      <w:lvlJc w:val="left"/>
+    </w:lvl>
+    <w:lvl w:ilvl="3" w:tplc="5CAED228">
+      <w:numFmt w:val="decimal"/>
+      <w:lvlText w:val=""/>
+      <w:lvlJc w:val="left"/>
+    </w:lvl>
+    <w:lvl w:ilvl="4" w:tplc="E3A86754">
+      <w:numFmt w:val="decimal"/>
+      <w:lvlText w:val=""/>
+      <w:lvlJc w:val="left"/>
+    </w:lvl>
+    <w:lvl w:ilvl="5" w:tplc="64F6CB94">
+      <w:numFmt w:val="decimal"/>
+      <w:lvlText w:val=""/>
+      <w:lvlJc w:val="left"/>
+    </w:lvl>
+    <w:lvl w:ilvl="6" w:tplc="7DB2886A">
+      <w:numFmt w:val="decimal"/>
+      <w:lvlText w:val=""/>
+      <w:lvlJc w:val="left"/>
+    </w:lvl>
+    <w:lvl w:ilvl="7" w:tplc="D338C5FE">
+      <w:numFmt w:val="decimal"/>
+      <w:lvlText w:val=""/>
+      <w:lvlJc w:val="left"/>
+    </w:lvl>
+    <w:lvl w:ilvl="8" w:tplc="20C4502E">
+      <w:numFmt w:val="decimal"/>
+      <w:lvlText w:val=""/>
+      <w:lvlJc w:val="left"/>
+    </w:lvl>
+  </w:abstractNum>
+  <w:abstractNum w:abstractNumId="1">
+    <w:nsid w:val="327D309E"/>
+    <w:multiLevelType w:val="hybridMultilevel"/>
+    <w:tmpl w:val="B6CAED82"/>
+    <w:lvl w:ilvl="0" w:tplc="27D0A414">
       <w:start w:val="1"/>
       <w:numFmt w:val="decimal"/>
       <w:lvlText w:val="%1."/>
@@ -6068,7 +6129,7 @@
         <w:color w:val="024638"/>
       </w:rPr>
     </w:lvl>
-    <w:lvl w:ilvl="1" w:tplc="618CD332">
+    <w:lvl w:ilvl="1" w:tplc="08C4C0B6">
       <w:start w:val="1"/>
       <w:numFmt w:val="lowerLetter"/>
       <w:lvlText w:val="%2."/>
@@ -6077,47 +6138,47 @@
         <w:ind w:left="1080" w:hanging="360"/>
       </w:pPr>
     </w:lvl>
-    <w:lvl w:ilvl="2" w:tplc="E5DE18E2">
+    <w:lvl w:ilvl="2" w:tplc="77403A02">
       <w:numFmt w:val="decimal"/>
       <w:lvlText w:val=""/>
       <w:lvlJc w:val="left"/>
     </w:lvl>
-    <w:lvl w:ilvl="3" w:tplc="07A6EC02">
+    <w:lvl w:ilvl="3" w:tplc="CE60B368">
       <w:numFmt w:val="decimal"/>
       <w:lvlText w:val=""/>
       <w:lvlJc w:val="left"/>
     </w:lvl>
-    <w:lvl w:ilvl="4" w:tplc="CBB0CB2A">
+    <w:lvl w:ilvl="4" w:tplc="20E67CD2">
       <w:numFmt w:val="decimal"/>
       <w:lvlText w:val=""/>
       <w:lvlJc w:val="left"/>
     </w:lvl>
-    <w:lvl w:ilvl="5" w:tplc="8DDCB920">
+    <w:lvl w:ilvl="5" w:tplc="11AAF516">
       <w:numFmt w:val="decimal"/>
       <w:lvlText w:val=""/>
       <w:lvlJc w:val="left"/>
     </w:lvl>
-    <w:lvl w:ilvl="6" w:tplc="719847FC">
+    <w:lvl w:ilvl="6" w:tplc="D76865D2">
       <w:numFmt w:val="decimal"/>
       <w:lvlText w:val=""/>
       <w:lvlJc w:val="left"/>
     </w:lvl>
-    <w:lvl w:ilvl="7" w:tplc="E9283A56">
+    <w:lvl w:ilvl="7" w:tplc="946218E0">
       <w:numFmt w:val="decimal"/>
       <w:lvlText w:val=""/>
       <w:lvlJc w:val="left"/>
     </w:lvl>
-    <w:lvl w:ilvl="8" w:tplc="3D7AC122">
+    <w:lvl w:ilvl="8" w:tplc="8DB87554">
       <w:numFmt w:val="decimal"/>
       <w:lvlText w:val=""/>
       <w:lvlJc w:val="left"/>
     </w:lvl>
   </w:abstractNum>
-  <w:abstractNum w:abstractNumId="1">
-    <w:nsid w:val="0C710400"/>
+  <w:abstractNum w:abstractNumId="2">
+    <w:nsid w:val="43863F91"/>
     <w:multiLevelType w:val="hybridMultilevel"/>
-    <w:tmpl w:val="2C482496"/>
-    <w:lvl w:ilvl="0" w:tplc="F662C2A8">
+    <w:tmpl w:val="D758E7C6"/>
+    <w:lvl w:ilvl="0" w:tplc="5304298A">
       <w:start w:val="1"/>
       <w:numFmt w:val="bullet"/>
       <w:lvlText w:val="●"/>
@@ -6126,7 +6187,7 @@
         <w:ind w:left="720" w:hanging="360"/>
       </w:pPr>
     </w:lvl>
-    <w:lvl w:ilvl="1" w:tplc="45C27354">
+    <w:lvl w:ilvl="1" w:tplc="2130A10C">
       <w:start w:val="1"/>
       <w:numFmt w:val="bullet"/>
       <w:lvlText w:val="○"/>
@@ -6135,7 +6196,7 @@
         <w:ind w:left="1440" w:hanging="360"/>
       </w:pPr>
     </w:lvl>
-    <w:lvl w:ilvl="2" w:tplc="BA4C9DCA">
+    <w:lvl w:ilvl="2" w:tplc="FBD6FBA6">
       <w:start w:val="1"/>
       <w:numFmt w:val="bullet"/>
       <w:lvlText w:val="■"/>
@@ -6144,7 +6205,7 @@
         <w:ind w:left="2160" w:hanging="360"/>
       </w:pPr>
     </w:lvl>
-    <w:lvl w:ilvl="3" w:tplc="EF66CCD4">
+    <w:lvl w:ilvl="3" w:tplc="9E00E31E">
       <w:start w:val="1"/>
       <w:numFmt w:val="bullet"/>
       <w:lvlText w:val="●"/>
@@ -6153,7 +6214,7 @@
         <w:ind w:left="2880" w:hanging="360"/>
       </w:pPr>
     </w:lvl>
-    <w:lvl w:ilvl="4" w:tplc="6C1037BC">
+    <w:lvl w:ilvl="4" w:tplc="8A427164">
       <w:start w:val="1"/>
       <w:numFmt w:val="bullet"/>
       <w:lvlText w:val="○"/>
@@ -6162,7 +6223,7 @@
         <w:ind w:left="3600" w:hanging="360"/>
       </w:pPr>
     </w:lvl>
-    <w:lvl w:ilvl="5" w:tplc="93E2AF56">
+    <w:lvl w:ilvl="5" w:tplc="AB42856A">
       <w:start w:val="1"/>
       <w:numFmt w:val="bullet"/>
       <w:lvlText w:val="■"/>
@@ -6171,7 +6232,7 @@
         <w:ind w:left="4320" w:hanging="360"/>
       </w:pPr>
     </w:lvl>
-    <w:lvl w:ilvl="6" w:tplc="00A2A538">
+    <w:lvl w:ilvl="6" w:tplc="CFE2AFAC">
       <w:start w:val="1"/>
       <w:numFmt w:val="bullet"/>
       <w:lvlText w:val="●"/>
@@ -6180,7 +6241,7 @@
         <w:ind w:left="5040" w:hanging="360"/>
       </w:pPr>
     </w:lvl>
-    <w:lvl w:ilvl="7" w:tplc="FA2E5D58">
+    <w:lvl w:ilvl="7" w:tplc="0CDEECA0">
       <w:start w:val="1"/>
       <w:numFmt w:val="bullet"/>
       <w:lvlText w:val="●"/>
@@ -6189,7 +6250,7 @@
         <w:ind w:left="5760" w:hanging="360"/>
       </w:pPr>
     </w:lvl>
-    <w:lvl w:ilvl="8" w:tplc="85C0B0AE">
+    <w:lvl w:ilvl="8" w:tplc="471ECF1C">
       <w:start w:val="1"/>
       <w:numFmt w:val="bullet"/>
       <w:lvlText w:val="●"/>
@@ -6199,11 +6260,11 @@
       </w:pPr>
     </w:lvl>
   </w:abstractNum>
-  <w:abstractNum w:abstractNumId="2">
-    <w:nsid w:val="193667F1"/>
+  <w:abstractNum w:abstractNumId="3">
+    <w:nsid w:val="44A405F3"/>
     <w:multiLevelType w:val="hybridMultilevel"/>
-    <w:tmpl w:val="912E29A6"/>
-    <w:lvl w:ilvl="0" w:tplc="4ED21F04">
+    <w:tmpl w:val="DA7C83F4"/>
+    <w:lvl w:ilvl="0" w:tplc="8EFA82AC">
       <w:start w:val="1"/>
       <w:numFmt w:val="decimal"/>
       <w:lvlText w:val="%1."/>
@@ -6217,7 +6278,7 @@
         <w:color w:val="024638"/>
       </w:rPr>
     </w:lvl>
-    <w:lvl w:ilvl="1" w:tplc="3412FFCA">
+    <w:lvl w:ilvl="1" w:tplc="A64C3C54">
       <w:start w:val="1"/>
       <w:numFmt w:val="lowerLetter"/>
       <w:lvlText w:val="%2."/>
@@ -6226,108 +6287,47 @@
         <w:ind w:left="1080" w:hanging="360"/>
       </w:pPr>
     </w:lvl>
-    <w:lvl w:ilvl="2" w:tplc="96B6726C">
+    <w:lvl w:ilvl="2" w:tplc="E1AAE6C6">
       <w:numFmt w:val="decimal"/>
       <w:lvlText w:val=""/>
       <w:lvlJc w:val="left"/>
     </w:lvl>
-    <w:lvl w:ilvl="3" w:tplc="17987122">
+    <w:lvl w:ilvl="3" w:tplc="FB302C38">
       <w:numFmt w:val="decimal"/>
       <w:lvlText w:val=""/>
       <w:lvlJc w:val="left"/>
     </w:lvl>
-    <w:lvl w:ilvl="4" w:tplc="7DE42FBA">
+    <w:lvl w:ilvl="4" w:tplc="AECC3586">
       <w:numFmt w:val="decimal"/>
       <w:lvlText w:val=""/>
       <w:lvlJc w:val="left"/>
     </w:lvl>
-    <w:lvl w:ilvl="5" w:tplc="76309DC4">
+    <w:lvl w:ilvl="5" w:tplc="D3FAA5C4">
       <w:numFmt w:val="decimal"/>
       <w:lvlText w:val=""/>
       <w:lvlJc w:val="left"/>
     </w:lvl>
-    <w:lvl w:ilvl="6" w:tplc="E5766A20">
+    <w:lvl w:ilvl="6" w:tplc="DA9C1A6E">
       <w:numFmt w:val="decimal"/>
       <w:lvlText w:val=""/>
       <w:lvlJc w:val="left"/>
     </w:lvl>
-    <w:lvl w:ilvl="7" w:tplc="BBAC5984">
+    <w:lvl w:ilvl="7" w:tplc="4F0E5BCE">
       <w:numFmt w:val="decimal"/>
       <w:lvlText w:val=""/>
       <w:lvlJc w:val="left"/>
     </w:lvl>
-    <w:lvl w:ilvl="8" w:tplc="B5D09880">
-      <w:numFmt w:val="decimal"/>
-      <w:lvlText w:val=""/>
-      <w:lvlJc w:val="left"/>
-    </w:lvl>
-  </w:abstractNum>
-  <w:abstractNum w:abstractNumId="3">
-    <w:nsid w:val="543D6860"/>
-    <w:multiLevelType w:val="hybridMultilevel"/>
-    <w:tmpl w:val="FF2E1F8C"/>
-    <w:lvl w:ilvl="0" w:tplc="AF223DF6">
-      <w:start w:val="1"/>
-      <w:numFmt w:val="bullet"/>
-      <w:lvlText w:val="•"/>
-      <w:lvlJc w:val="left"/>
-      <w:pPr>
-        <w:ind w:left="540" w:hanging="270"/>
-      </w:pPr>
-      <w:rPr>
-        <w:color w:val="228848"/>
-      </w:rPr>
-    </w:lvl>
-    <w:lvl w:ilvl="1" w:tplc="7D28FF36">
-      <w:start w:val="1"/>
-      <w:numFmt w:val="bullet"/>
-      <w:lvlText w:val="–"/>
-      <w:lvlJc w:val="left"/>
-      <w:pPr>
-        <w:ind w:left="1080" w:hanging="270"/>
-      </w:pPr>
-    </w:lvl>
-    <w:lvl w:ilvl="2" w:tplc="8482F0A2">
-      <w:numFmt w:val="decimal"/>
-      <w:lvlText w:val=""/>
-      <w:lvlJc w:val="left"/>
-    </w:lvl>
-    <w:lvl w:ilvl="3" w:tplc="3468E556">
-      <w:numFmt w:val="decimal"/>
-      <w:lvlText w:val=""/>
-      <w:lvlJc w:val="left"/>
-    </w:lvl>
-    <w:lvl w:ilvl="4" w:tplc="CEFE5F08">
-      <w:numFmt w:val="decimal"/>
-      <w:lvlText w:val=""/>
-      <w:lvlJc w:val="left"/>
-    </w:lvl>
-    <w:lvl w:ilvl="5" w:tplc="1750B06C">
-      <w:numFmt w:val="decimal"/>
-      <w:lvlText w:val=""/>
-      <w:lvlJc w:val="left"/>
-    </w:lvl>
-    <w:lvl w:ilvl="6" w:tplc="B726E33E">
-      <w:numFmt w:val="decimal"/>
-      <w:lvlText w:val=""/>
-      <w:lvlJc w:val="left"/>
-    </w:lvl>
-    <w:lvl w:ilvl="7" w:tplc="75641BA8">
-      <w:numFmt w:val="decimal"/>
-      <w:lvlText w:val=""/>
-      <w:lvlJc w:val="left"/>
-    </w:lvl>
-    <w:lvl w:ilvl="8" w:tplc="4AC6EE9A">
+    <w:lvl w:ilvl="8" w:tplc="6C661868">
       <w:numFmt w:val="decimal"/>
       <w:lvlText w:val=""/>
       <w:lvlJc w:val="left"/>
     </w:lvl>
   </w:abstractNum>
   <w:abstractNum w:abstractNumId="4">
-    <w:nsid w:val="5C0E5093"/>
+    <w:nsid w:val="48064563"/>
     <w:multiLevelType w:val="hybridMultilevel"/>
-    <w:tmpl w:val="9BF23502"/>
-    <w:lvl w:ilvl="0" w:tplc="141CD284">
+    <w:tmpl w:val="4E8CB404"/>
+    <w:lvl w:ilvl="0" w:tplc="71622EB2">
       <w:start w:val="1"/>
       <w:numFmt w:val="decimal"/>
       <w:lvlText w:val="%1."/>
@@ -6341,7 +6341,7 @@
         <w:color w:val="024638"/>
       </w:rPr>
     </w:lvl>
-    <w:lvl w:ilvl="1" w:tplc="C886340C">
+    <w:lvl w:ilvl="1" w:tplc="AAE48F40">
       <w:start w:val="1"/>
       <w:numFmt w:val="lowerLetter"/>
       <w:lvlText w:val="%2."/>
@@ -6350,62 +6350,62 @@
         <w:ind w:left="1080" w:hanging="360"/>
       </w:pPr>
     </w:lvl>
-    <w:lvl w:ilvl="2" w:tplc="29CA9AA8">
+    <w:lvl w:ilvl="2" w:tplc="160AE474">
       <w:numFmt w:val="decimal"/>
       <w:lvlText w:val=""/>
       <w:lvlJc w:val="left"/>
     </w:lvl>
-    <w:lvl w:ilvl="3" w:tplc="C292CBD0">
+    <w:lvl w:ilvl="3" w:tplc="F6560350">
       <w:numFmt w:val="decimal"/>
       <w:lvlText w:val=""/>
       <w:lvlJc w:val="left"/>
     </w:lvl>
-    <w:lvl w:ilvl="4" w:tplc="71425CC6">
+    <w:lvl w:ilvl="4" w:tplc="7226A10A">
       <w:numFmt w:val="decimal"/>
       <w:lvlText w:val=""/>
       <w:lvlJc w:val="left"/>
     </w:lvl>
-    <w:lvl w:ilvl="5" w:tplc="B0C64528">
+    <w:lvl w:ilvl="5" w:tplc="7ABE3EF8">
       <w:numFmt w:val="decimal"/>
       <w:lvlText w:val=""/>
       <w:lvlJc w:val="left"/>
     </w:lvl>
-    <w:lvl w:ilvl="6" w:tplc="9F40D998">
+    <w:lvl w:ilvl="6" w:tplc="3A6A3CF8">
       <w:numFmt w:val="decimal"/>
       <w:lvlText w:val=""/>
       <w:lvlJc w:val="left"/>
     </w:lvl>
-    <w:lvl w:ilvl="7" w:tplc="5E2AD822">
+    <w:lvl w:ilvl="7" w:tplc="80385E3C">
       <w:numFmt w:val="decimal"/>
       <w:lvlText w:val=""/>
       <w:lvlJc w:val="left"/>
     </w:lvl>
-    <w:lvl w:ilvl="8" w:tplc="48DA1F9A">
+    <w:lvl w:ilvl="8" w:tplc="9DA89C3E">
       <w:numFmt w:val="decimal"/>
       <w:lvlText w:val=""/>
       <w:lvlJc w:val="left"/>
     </w:lvl>
   </w:abstractNum>
   <w:num w:numId="1">
+    <w:abstractNumId w:val="2"/>
+    <w:lvlOverride w:ilvl="0">
+      <w:startOverride w:val="1"/>
+    </w:lvlOverride>
+  </w:num>
+  <w:num w:numId="2">
+    <w:abstractNumId w:val="0"/>
+    <w:lvlOverride w:ilvl="0">
+      <w:startOverride w:val="1"/>
+    </w:lvlOverride>
+  </w:num>
+  <w:num w:numId="3">
     <w:abstractNumId w:val="1"/>
     <w:lvlOverride w:ilvl="0">
       <w:startOverride w:val="1"/>
     </w:lvlOverride>
   </w:num>
-  <w:num w:numId="2">
+  <w:num w:numId="4">
     <w:abstractNumId w:val="3"/>
-    <w:lvlOverride w:ilvl="0">
-      <w:startOverride w:val="1"/>
-    </w:lvlOverride>
-  </w:num>
-  <w:num w:numId="3">
-    <w:abstractNumId w:val="2"/>
-    <w:lvlOverride w:ilvl="0">
-      <w:startOverride w:val="1"/>
-    </w:lvlOverride>
-  </w:num>
-  <w:num w:numId="4">
-    <w:abstractNumId w:val="0"/>
     <w:lvlOverride w:ilvl="0">
       <w:startOverride w:val="1"/>
     </w:lvlOverride>
@@ -6740,7 +6740,7 @@
     <w:autoRedefine/>
     <w:uiPriority w:val="39"/>
     <w:unhideWhenUsed/>
-    <w:rsid w:val="003A1D15"/>
+    <w:rsid w:val="0063626C"/>
     <w:pPr>
       <w:spacing w:after="100"/>
     </w:pPr>
@@ -7069,7 +7069,7 @@
     <w:autoRedefine/>
     <w:uiPriority w:val="39"/>
     <w:unhideWhenUsed/>
-    <w:rsid w:val="003A1D15"/>
+    <w:rsid w:val="0063626C"/>
     <w:pPr>
       <w:spacing w:after="100"/>
     </w:pPr>

</xml_diff>